<commit_message>
Fixing materials and adding week 5 report
</commit_message>
<xml_diff>
--- a/Week 3-Use Case Specifications.docx
+++ b/Week 3-Use Case Specifications.docx
@@ -60,24 +60,13 @@
         <w:spacing w:before="80" w:after="60" w:line="264" w:lineRule="auto"/>
       </w:pPr>
       <w:r>
-        <w:t>UC-T-</w:t>
-      </w:r>
-      <w:proofErr w:type="gramStart"/>
-      <w:r>
-        <w:t>0</w:t>
-      </w:r>
-      <w:r>
         <w:rPr>
           <w:lang w:val="en-DE"/>
         </w:rPr>
-        <w:t>1</w:t>
+        <w:t xml:space="preserve">FR1 - </w:t>
       </w:r>
       <w:r>
-        <w:t xml:space="preserve">  Update</w:t>
-      </w:r>
-      <w:proofErr w:type="gramEnd"/>
-      <w:r>
-        <w:t xml:space="preserve"> Personal Information</w:t>
+        <w:t>Update Personal Information</w:t>
       </w:r>
     </w:p>
     <w:tbl>
@@ -140,7 +129,14 @@
                 <w:sz w:val="19"/>
                 <w:lang w:val="en-DE"/>
               </w:rPr>
-              <w:t xml:space="preserve">UC-T-01 </w:t>
+              <w:t>FR1</w:t>
+            </w:r>
+            <w:r>
+              <w:rPr>
+                <w:sz w:val="19"/>
+                <w:lang w:val="en-DE"/>
+              </w:rPr>
+              <w:t xml:space="preserve"> </w:t>
             </w:r>
             <w:r>
               <w:rPr>
@@ -517,26 +513,33 @@
       <w:pPr>
         <w:pStyle w:val="Heading2"/>
         <w:spacing w:before="80" w:after="60" w:line="264" w:lineRule="auto"/>
+        <w:rPr>
+          <w:lang w:val="en-DE"/>
+        </w:rPr>
       </w:pPr>
       <w:r>
-        <w:t>UC-T-</w:t>
+        <w:rPr>
+          <w:lang w:val="en-DE"/>
+        </w:rPr>
+        <w:t>FR2</w:t>
       </w:r>
-      <w:proofErr w:type="gramStart"/>
       <w:r>
-        <w:t>0</w:t>
+        <w:t xml:space="preserve"> </w:t>
       </w:r>
       <w:r>
         <w:rPr>
           <w:lang w:val="en-DE"/>
         </w:rPr>
-        <w:t>2</w:t>
+        <w:t>-</w:t>
       </w:r>
       <w:r>
-        <w:t xml:space="preserve">  Search</w:t>
+        <w:t xml:space="preserve"> Search Properties</w:t>
       </w:r>
-      <w:proofErr w:type="gramEnd"/>
       <w:r>
-        <w:t xml:space="preserve"> Properties</w:t>
+        <w:rPr>
+          <w:lang w:val="en-DE"/>
+        </w:rPr>
+        <w:t xml:space="preserve"> based on their preferences</w:t>
       </w:r>
     </w:p>
     <w:tbl>
@@ -593,18 +596,22 @@
           <w:p>
             <w:pPr>
               <w:spacing w:line="259" w:lineRule="auto"/>
-            </w:pPr>
-            <w:r>
-              <w:rPr>
-                <w:sz w:val="19"/>
-              </w:rPr>
-              <w:t>UC-T-0</w:t>
-            </w:r>
-            <w:r>
-              <w:rPr>
-                <w:sz w:val="19"/>
+              <w:rPr>
                 <w:lang w:val="en-DE"/>
               </w:rPr>
+            </w:pPr>
+            <w:r>
+              <w:rPr>
+                <w:sz w:val="19"/>
+                <w:lang w:val="en-DE"/>
+              </w:rPr>
+              <w:t>FR</w:t>
+            </w:r>
+            <w:r>
+              <w:rPr>
+                <w:sz w:val="19"/>
+                <w:lang w:val="en-DE"/>
+              </w:rPr>
               <w:t xml:space="preserve">2 </w:t>
             </w:r>
             <w:r>
@@ -626,6 +633,13 @@
                 <w:sz w:val="19"/>
               </w:rPr>
               <w:t>Search Properties</w:t>
+            </w:r>
+            <w:r>
+              <w:rPr>
+                <w:sz w:val="19"/>
+                <w:lang w:val="en-DE"/>
+              </w:rPr>
+              <w:t xml:space="preserve"> based on their preferences</w:t>
             </w:r>
           </w:p>
         </w:tc>
@@ -989,31 +1003,31 @@
         </w:rPr>
       </w:pPr>
       <w:r>
+        <w:rPr>
+          <w:lang w:val="en-DE"/>
+        </w:rPr>
         <w:lastRenderedPageBreak/>
-        <w:t>UC-T-</w:t>
+        <w:t xml:space="preserve">FR3 - </w:t>
+      </w:r>
+      <w:r>
+        <w:t xml:space="preserve">Filter Properties by </w:t>
       </w:r>
       <w:proofErr w:type="gramStart"/>
       <w:r>
-        <w:t>0</w:t>
+        <w:t>Location</w:t>
       </w:r>
       <w:r>
         <w:rPr>
           <w:lang w:val="en-DE"/>
         </w:rPr>
-        <w:t>3</w:t>
-      </w:r>
-      <w:r>
-        <w:t xml:space="preserve">  Filter</w:t>
+        <w:t>,Price</w:t>
       </w:r>
       <w:proofErr w:type="gramEnd"/>
-      <w:r>
-        <w:t xml:space="preserve"> Properties by Location</w:t>
-      </w:r>
       <w:r>
         <w:rPr>
           <w:lang w:val="en-DE"/>
         </w:rPr>
-        <w:t>,Price and Property type</w:t>
+        <w:t xml:space="preserve"> and Property type</w:t>
       </w:r>
     </w:p>
     <w:tbl>
@@ -1089,8 +1103,9 @@
                 <w:rFonts w:asciiTheme="majorHAnsi" w:hAnsiTheme="majorHAnsi" w:cstheme="majorHAnsi"/>
                 <w:sz w:val="19"/>
                 <w:szCs w:val="19"/>
-              </w:rPr>
-              <w:t>UC-T-0</w:t>
+                <w:lang w:val="en-DE"/>
+              </w:rPr>
+              <w:t>FR3</w:t>
             </w:r>
             <w:r>
               <w:rPr>
@@ -1099,7 +1114,7 @@
                 <w:szCs w:val="19"/>
                 <w:lang w:val="en-DE"/>
               </w:rPr>
-              <w:t xml:space="preserve">3 </w:t>
+              <w:t xml:space="preserve"> </w:t>
             </w:r>
             <w:r>
               <w:rPr>
@@ -1698,24 +1713,22 @@
         </w:rPr>
       </w:pPr>
       <w:r>
-        <w:t>UC-T-</w:t>
+        <w:rPr>
+          <w:lang w:val="en-DE"/>
+        </w:rPr>
+        <w:t>FR4</w:t>
       </w:r>
-      <w:proofErr w:type="gramStart"/>
       <w:r>
-        <w:t>0</w:t>
+        <w:t xml:space="preserve"> </w:t>
       </w:r>
       <w:r>
         <w:rPr>
           <w:lang w:val="en-DE"/>
         </w:rPr>
-        <w:t>4</w:t>
+        <w:t xml:space="preserve">- </w:t>
       </w:r>
       <w:r>
-        <w:t xml:space="preserve">  View</w:t>
-      </w:r>
-      <w:proofErr w:type="gramEnd"/>
-      <w:r>
-        <w:t xml:space="preserve"> Property Details</w:t>
+        <w:t>View Property Details</w:t>
       </w:r>
       <w:r>
         <w:rPr>
@@ -1793,16 +1806,17 @@
               <w:rPr>
                 <w:sz w:val="19"/>
                 <w:szCs w:val="19"/>
-              </w:rPr>
-              <w:t>UC-T-0</w:t>
-            </w:r>
-            <w:r>
-              <w:rPr>
-                <w:sz w:val="19"/>
-                <w:szCs w:val="19"/>
                 <w:lang w:val="en-DE"/>
               </w:rPr>
-              <w:t xml:space="preserve">4 </w:t>
+              <w:t>FR4</w:t>
+            </w:r>
+            <w:r>
+              <w:rPr>
+                <w:sz w:val="19"/>
+                <w:szCs w:val="19"/>
+                <w:lang w:val="en-DE"/>
+              </w:rPr>
+              <w:t xml:space="preserve"> </w:t>
             </w:r>
             <w:r>
               <w:rPr>
@@ -2258,12 +2272,55 @@
           <w:lang w:val="en-DE"/>
         </w:rPr>
       </w:pPr>
+    </w:p>
+    <w:p>
+      <w:pPr>
+        <w:pStyle w:val="Heading2"/>
+        <w:spacing w:before="80" w:after="60" w:line="264" w:lineRule="auto"/>
+        <w:rPr>
+          <w:lang w:val="en-DE"/>
+        </w:rPr>
+      </w:pPr>
+    </w:p>
+    <w:p>
+      <w:pPr>
+        <w:pStyle w:val="Heading2"/>
+        <w:spacing w:before="80" w:after="60" w:line="264" w:lineRule="auto"/>
+        <w:rPr>
+          <w:lang w:val="en-DE"/>
+        </w:rPr>
+      </w:pPr>
+    </w:p>
+    <w:p>
+      <w:pPr>
+        <w:pStyle w:val="Heading2"/>
+        <w:spacing w:before="80" w:after="60" w:line="264" w:lineRule="auto"/>
+        <w:rPr>
+          <w:lang w:val="en-DE"/>
+        </w:rPr>
+      </w:pPr>
+    </w:p>
+    <w:p>
+      <w:pPr>
+        <w:rPr>
+          <w:lang w:val="en-DE"/>
+        </w:rPr>
+      </w:pPr>
+    </w:p>
+    <w:p>
+      <w:pPr>
+        <w:pStyle w:val="Heading2"/>
+        <w:spacing w:before="80" w:after="60" w:line="264" w:lineRule="auto"/>
+        <w:rPr>
+          <w:lang w:val="en-DE"/>
+        </w:rPr>
+      </w:pPr>
       <w:r>
-        <w:t>UC-T-</w:t>
-      </w:r>
-      <w:proofErr w:type="gramStart"/>
-      <w:r>
-        <w:t>0</w:t>
+        <w:rPr>
+          <w:lang w:val="en-DE"/>
+        </w:rPr>
+        <w:lastRenderedPageBreak/>
+        <w:t>FR</w:t>
       </w:r>
       <w:r>
         <w:rPr>
@@ -2272,11 +2329,16 @@
         <w:t>5</w:t>
       </w:r>
       <w:r>
-        <w:t xml:space="preserve">  Send</w:t>
+        <w:t xml:space="preserve"> </w:t>
       </w:r>
-      <w:proofErr w:type="gramEnd"/>
       <w:r>
-        <w:t xml:space="preserve"> Rental Request</w:t>
+        <w:rPr>
+          <w:lang w:val="en-DE"/>
+        </w:rPr>
+        <w:t>-</w:t>
+      </w:r>
+      <w:r>
+        <w:t xml:space="preserve"> Send Rental Request</w:t>
       </w:r>
       <w:r>
         <w:rPr>
@@ -2358,8 +2420,9 @@
                 <w:rFonts w:asciiTheme="majorHAnsi" w:hAnsiTheme="majorHAnsi" w:cstheme="majorHAnsi"/>
                 <w:sz w:val="19"/>
                 <w:szCs w:val="19"/>
-              </w:rPr>
-              <w:t>UC-T-0</w:t>
+                <w:lang w:val="en-DE"/>
+              </w:rPr>
+              <w:t>FR5</w:t>
             </w:r>
             <w:r>
               <w:rPr>
@@ -2368,7 +2431,7 @@
                 <w:szCs w:val="19"/>
                 <w:lang w:val="en-DE"/>
               </w:rPr>
-              <w:t xml:space="preserve">5 </w:t>
+              <w:t xml:space="preserve"> </w:t>
             </w:r>
             <w:r>
               <w:rPr>
@@ -2732,7 +2795,6 @@
                 <w:sz w:val="19"/>
                 <w:szCs w:val="19"/>
               </w:rPr>
-              <w:lastRenderedPageBreak/>
               <w:t>Main Success Flow</w:t>
             </w:r>
           </w:p>
@@ -2955,21 +3017,28 @@
         <w:spacing w:before="80" w:after="60" w:line="264" w:lineRule="auto"/>
       </w:pPr>
       <w:r>
-        <w:t>UC-T-</w:t>
+        <w:rPr>
+          <w:lang w:val="en-DE"/>
+        </w:rPr>
+        <w:t>FR</w:t>
       </w:r>
-      <w:proofErr w:type="gramStart"/>
       <w:r>
         <w:rPr>
           <w:lang w:val="en-DE"/>
         </w:rPr>
-        <w:t>06</w:t>
+        <w:t>6</w:t>
       </w:r>
       <w:r>
-        <w:t xml:space="preserve">  Cancel</w:t>
+        <w:t xml:space="preserve"> </w:t>
       </w:r>
-      <w:proofErr w:type="gramEnd"/>
       <w:r>
-        <w:t xml:space="preserve"> Rental Request</w:t>
+        <w:rPr>
+          <w:lang w:val="en-DE"/>
+        </w:rPr>
+        <w:t>-</w:t>
+      </w:r>
+      <w:r>
+        <w:t xml:space="preserve"> Cancel Rental Request</w:t>
       </w:r>
     </w:p>
     <w:tbl>
@@ -3040,16 +3109,17 @@
               <w:rPr>
                 <w:sz w:val="19"/>
                 <w:szCs w:val="19"/>
-              </w:rPr>
-              <w:t>UC-T-</w:t>
-            </w:r>
-            <w:r>
-              <w:rPr>
-                <w:sz w:val="19"/>
-                <w:szCs w:val="19"/>
                 <w:lang w:val="en-DE"/>
               </w:rPr>
-              <w:t>06</w:t>
+              <w:t>FR</w:t>
+            </w:r>
+            <w:r>
+              <w:rPr>
+                <w:sz w:val="19"/>
+                <w:szCs w:val="19"/>
+                <w:lang w:val="en-DE"/>
+              </w:rPr>
+              <w:t>6</w:t>
             </w:r>
             <w:r>
               <w:rPr>
@@ -3495,6 +3565,8 @@
         </w:tc>
       </w:tr>
     </w:tbl>
+    <w:p/>
+    <w:p/>
     <w:p/>
     <w:p>
       <w:pPr>
@@ -3502,21 +3574,29 @@
         <w:spacing w:before="80" w:after="60" w:line="264" w:lineRule="auto"/>
       </w:pPr>
       <w:r>
-        <w:t>UC-T-</w:t>
+        <w:rPr>
+          <w:lang w:val="en-DE"/>
+        </w:rPr>
+        <w:lastRenderedPageBreak/>
+        <w:t>FR</w:t>
       </w:r>
-      <w:proofErr w:type="gramStart"/>
       <w:r>
         <w:rPr>
           <w:lang w:val="en-DE"/>
         </w:rPr>
-        <w:t>07</w:t>
+        <w:t>7</w:t>
       </w:r>
       <w:r>
-        <w:t xml:space="preserve">  Receive</w:t>
+        <w:t xml:space="preserve"> </w:t>
       </w:r>
-      <w:proofErr w:type="gramEnd"/>
       <w:r>
-        <w:t xml:space="preserve"> Messages from Property Owner</w:t>
+        <w:rPr>
+          <w:lang w:val="en-DE"/>
+        </w:rPr>
+        <w:t>-</w:t>
+      </w:r>
+      <w:r>
+        <w:t xml:space="preserve"> Receive Messages from Property Owner</w:t>
       </w:r>
     </w:p>
     <w:tbl>
@@ -3582,16 +3662,17 @@
               <w:rPr>
                 <w:sz w:val="19"/>
                 <w:szCs w:val="19"/>
-              </w:rPr>
-              <w:t>UC-T-</w:t>
-            </w:r>
-            <w:r>
-              <w:rPr>
-                <w:sz w:val="19"/>
-                <w:szCs w:val="19"/>
                 <w:lang w:val="en-DE"/>
               </w:rPr>
-              <w:t xml:space="preserve">07 </w:t>
+              <w:t>FR7</w:t>
+            </w:r>
+            <w:r>
+              <w:rPr>
+                <w:sz w:val="19"/>
+                <w:szCs w:val="19"/>
+                <w:lang w:val="en-DE"/>
+              </w:rPr>
+              <w:t xml:space="preserve"> </w:t>
             </w:r>
             <w:r>
               <w:rPr>
@@ -3877,7 +3958,6 @@
                 <w:b/>
                 <w:sz w:val="19"/>
               </w:rPr>
-              <w:lastRenderedPageBreak/>
               <w:t>Alternative / Exception Flow</w:t>
             </w:r>
           </w:p>
@@ -3967,14 +4047,17 @@
         <w:spacing w:before="80" w:after="60" w:line="264" w:lineRule="auto"/>
       </w:pPr>
       <w:r>
-        <w:t>UC-T-</w:t>
+        <w:rPr>
+          <w:lang w:val="en-DE"/>
+        </w:rPr>
+        <w:t xml:space="preserve">FR8 </w:t>
       </w:r>
       <w:proofErr w:type="gramStart"/>
       <w:r>
         <w:rPr>
           <w:lang w:val="en-DE"/>
         </w:rPr>
-        <w:t>08</w:t>
+        <w:t>-</w:t>
       </w:r>
       <w:r>
         <w:t xml:space="preserve">  Submit</w:t>
@@ -4047,16 +4130,17 @@
               <w:rPr>
                 <w:sz w:val="19"/>
                 <w:szCs w:val="19"/>
-              </w:rPr>
-              <w:t>UC-T-</w:t>
-            </w:r>
-            <w:r>
-              <w:rPr>
-                <w:sz w:val="19"/>
-                <w:szCs w:val="19"/>
                 <w:lang w:val="en-DE"/>
               </w:rPr>
-              <w:t xml:space="preserve">08 </w:t>
+              <w:t>FR</w:t>
+            </w:r>
+            <w:r>
+              <w:rPr>
+                <w:sz w:val="19"/>
+                <w:szCs w:val="19"/>
+                <w:lang w:val="en-DE"/>
+              </w:rPr>
+              <w:t xml:space="preserve">8 </w:t>
             </w:r>
             <w:r>
               <w:rPr>
@@ -4483,17 +4567,28 @@
         </w:rPr>
       </w:pPr>
       <w:r>
-        <w:t>UC-T-</w:t>
+        <w:rPr>
+          <w:lang w:val="en-DE"/>
+        </w:rPr>
+        <w:t>FR</w:t>
       </w:r>
-      <w:proofErr w:type="gramStart"/>
       <w:r>
         <w:rPr>
           <w:lang w:val="en-DE"/>
         </w:rPr>
-        <w:t>09</w:t>
+        <w:t>9</w:t>
       </w:r>
       <w:r>
-        <w:t xml:space="preserve">  S</w:t>
+        <w:t xml:space="preserve"> </w:t>
+      </w:r>
+      <w:r>
+        <w:rPr>
+          <w:lang w:val="en-DE"/>
+        </w:rPr>
+        <w:t>-</w:t>
+      </w:r>
+      <w:r>
+        <w:t xml:space="preserve"> S</w:t>
       </w:r>
       <w:proofErr w:type="spellStart"/>
       <w:r>
@@ -4503,7 +4598,6 @@
         <w:t>ave</w:t>
       </w:r>
       <w:proofErr w:type="spellEnd"/>
-      <w:proofErr w:type="gramEnd"/>
       <w:r>
         <w:rPr>
           <w:lang w:val="en-DE"/>
@@ -4583,8 +4677,9 @@
                 <w:rFonts w:asciiTheme="majorHAnsi" w:hAnsiTheme="majorHAnsi" w:cstheme="majorHAnsi"/>
                 <w:sz w:val="19"/>
                 <w:szCs w:val="19"/>
-              </w:rPr>
-              <w:t>UC-T-</w:t>
+                <w:lang w:val="en-DE"/>
+              </w:rPr>
+              <w:t>FR</w:t>
             </w:r>
             <w:r>
               <w:rPr>
@@ -4593,7 +4688,7 @@
                 <w:szCs w:val="19"/>
                 <w:lang w:val="en-DE"/>
               </w:rPr>
-              <w:t xml:space="preserve">09 </w:t>
+              <w:t xml:space="preserve">9 </w:t>
             </w:r>
             <w:r>
               <w:rPr>
@@ -4996,6 +5091,14 @@
                 <w:szCs w:val="19"/>
               </w:rPr>
               <w:br/>
+            </w:r>
+            <w:r>
+              <w:rPr>
+                <w:rFonts w:asciiTheme="majorHAnsi" w:hAnsiTheme="majorHAnsi" w:cstheme="majorHAnsi"/>
+                <w:sz w:val="19"/>
+                <w:szCs w:val="19"/>
+              </w:rPr>
+              <w:lastRenderedPageBreak/>
               <w:t xml:space="preserve">3. The tenant clicks the “Save to Favorites” option. </w:t>
             </w:r>
             <w:r>
@@ -5051,6 +5154,7 @@
                 <w:sz w:val="19"/>
                 <w:szCs w:val="19"/>
               </w:rPr>
+              <w:lastRenderedPageBreak/>
               <w:t>Alternative / Exception Flow</w:t>
             </w:r>
           </w:p>
@@ -5154,7 +5258,6 @@
         </w:tc>
       </w:tr>
     </w:tbl>
-    <w:p/>
     <w:p/>
     <w:p>
       <w:pPr>
@@ -5165,31 +5268,28 @@
         </w:rPr>
       </w:pPr>
       <w:r>
-        <w:lastRenderedPageBreak/>
-        <w:t>UC-T-</w:t>
-      </w:r>
-      <w:proofErr w:type="gramStart"/>
-      <w:r>
         <w:rPr>
           <w:lang w:val="en-DE"/>
         </w:rPr>
-        <w:t>10</w:t>
+        <w:t>FR10</w:t>
       </w:r>
       <w:r>
-        <w:t xml:space="preserve">  </w:t>
+        <w:t xml:space="preserve"> </w:t>
       </w:r>
       <w:r>
         <w:rPr>
           <w:lang w:val="en-DE"/>
         </w:rPr>
-        <w:t>Review</w:t>
+        <w:t>-</w:t>
       </w:r>
-      <w:proofErr w:type="gramEnd"/>
+      <w:r>
+        <w:t xml:space="preserve"> </w:t>
+      </w:r>
       <w:r>
         <w:rPr>
           <w:lang w:val="en-DE"/>
         </w:rPr>
-        <w:t xml:space="preserve"> and Rate property</w:t>
+        <w:t>Review and Rate property</w:t>
       </w:r>
     </w:p>
     <w:tbl>
@@ -5265,8 +5365,9 @@
                 <w:rFonts w:asciiTheme="majorHAnsi" w:hAnsiTheme="majorHAnsi" w:cstheme="majorHAnsi"/>
                 <w:sz w:val="19"/>
                 <w:szCs w:val="19"/>
-              </w:rPr>
-              <w:t>UC-T-</w:t>
+                <w:lang w:val="en-DE"/>
+              </w:rPr>
+              <w:t>FR10</w:t>
             </w:r>
             <w:r>
               <w:rPr>
@@ -5275,7 +5376,7 @@
                 <w:szCs w:val="19"/>
                 <w:lang w:val="en-DE"/>
               </w:rPr>
-              <w:t xml:space="preserve">10 </w:t>
+              <w:t xml:space="preserve"> </w:t>
             </w:r>
             <w:r>
               <w:rPr>
@@ -5858,24 +5959,22 @@
         </w:rPr>
       </w:pPr>
       <w:r>
-        <w:t>UC-O-</w:t>
+        <w:rPr>
+          <w:lang w:val="en-DE"/>
+        </w:rPr>
+        <w:t>FR11</w:t>
       </w:r>
-      <w:proofErr w:type="gramStart"/>
       <w:r>
-        <w:t>0</w:t>
+        <w:t xml:space="preserve"> </w:t>
       </w:r>
       <w:r>
         <w:rPr>
           <w:lang w:val="en-DE"/>
         </w:rPr>
-        <w:t>1</w:t>
+        <w:t>-</w:t>
       </w:r>
       <w:r>
-        <w:t xml:space="preserve">  Update</w:t>
-      </w:r>
-      <w:proofErr w:type="gramEnd"/>
-      <w:r>
-        <w:t xml:space="preserve"> Profile Information</w:t>
+        <w:t xml:space="preserve"> Update Profile Information</w:t>
       </w:r>
       <w:r>
         <w:rPr>
@@ -5948,8 +6047,9 @@
               <w:rPr>
                 <w:sz w:val="19"/>
                 <w:szCs w:val="19"/>
-              </w:rPr>
-              <w:t>UC-O-0</w:t>
+                <w:lang w:val="en-DE"/>
+              </w:rPr>
+              <w:t>FR1</w:t>
             </w:r>
             <w:r>
               <w:rPr>
@@ -6252,6 +6352,13 @@
                 <w:szCs w:val="19"/>
               </w:rPr>
               <w:br/>
+            </w:r>
+            <w:r>
+              <w:rPr>
+                <w:sz w:val="19"/>
+                <w:szCs w:val="19"/>
+              </w:rPr>
+              <w:lastRenderedPageBreak/>
               <w:t xml:space="preserve">5. The property owner saves the changes. </w:t>
             </w:r>
             <w:r>
@@ -6290,6 +6397,7 @@
                 <w:b/>
                 <w:sz w:val="19"/>
               </w:rPr>
+              <w:lastRenderedPageBreak/>
               <w:t>Alternative / Exception Flow</w:t>
             </w:r>
           </w:p>
@@ -6389,12 +6497,10 @@
         <w:spacing w:before="80" w:after="60" w:line="264" w:lineRule="auto"/>
       </w:pPr>
       <w:r>
-        <w:lastRenderedPageBreak/>
-        <w:t>UC-O-</w:t>
-      </w:r>
-      <w:proofErr w:type="gramStart"/>
-      <w:r>
-        <w:t>0</w:t>
+        <w:rPr>
+          <w:lang w:val="en-DE"/>
+        </w:rPr>
+        <w:t>FR1</w:t>
       </w:r>
       <w:r>
         <w:rPr>
@@ -6403,11 +6509,16 @@
         <w:t>2</w:t>
       </w:r>
       <w:r>
-        <w:t xml:space="preserve">  Add</w:t>
+        <w:t xml:space="preserve"> </w:t>
       </w:r>
-      <w:proofErr w:type="gramEnd"/>
       <w:r>
-        <w:t xml:space="preserve"> Property Listing</w:t>
+        <w:rPr>
+          <w:lang w:val="en-DE"/>
+        </w:rPr>
+        <w:t>-</w:t>
+      </w:r>
+      <w:r>
+        <w:t xml:space="preserve"> Add Property Listing</w:t>
       </w:r>
     </w:p>
     <w:tbl>
@@ -6468,8 +6579,9 @@
             <w:r>
               <w:rPr>
                 <w:sz w:val="19"/>
-              </w:rPr>
-              <w:t>UC-O-0</w:t>
+                <w:lang w:val="en-DE"/>
+              </w:rPr>
+              <w:t>FR1</w:t>
             </w:r>
             <w:r>
               <w:rPr>
@@ -6855,11 +6967,10 @@
         <w:spacing w:before="80" w:after="60" w:line="264" w:lineRule="auto"/>
       </w:pPr>
       <w:r>
-        <w:t>UC-O-</w:t>
-      </w:r>
-      <w:proofErr w:type="gramStart"/>
-      <w:r>
-        <w:t>0</w:t>
+        <w:rPr>
+          <w:lang w:val="en-DE"/>
+        </w:rPr>
+        <w:t>FR1</w:t>
       </w:r>
       <w:r>
         <w:rPr>
@@ -6868,11 +6979,16 @@
         <w:t>3</w:t>
       </w:r>
       <w:r>
-        <w:t xml:space="preserve">  Upload</w:t>
+        <w:t xml:space="preserve"> </w:t>
       </w:r>
-      <w:proofErr w:type="gramEnd"/>
       <w:r>
-        <w:t xml:space="preserve"> Property Images</w:t>
+        <w:rPr>
+          <w:lang w:val="en-DE"/>
+        </w:rPr>
+        <w:t>-</w:t>
+      </w:r>
+      <w:r>
+        <w:t xml:space="preserve"> Upload Property Images</w:t>
       </w:r>
     </w:p>
     <w:tbl>
@@ -6933,8 +7049,9 @@
             <w:r>
               <w:rPr>
                 <w:sz w:val="19"/>
-              </w:rPr>
-              <w:t>UC-O-0</w:t>
+                <w:lang w:val="en-DE"/>
+              </w:rPr>
+              <w:t>FR1</w:t>
             </w:r>
             <w:r>
               <w:rPr>
@@ -7313,11 +7430,11 @@
         <w:spacing w:before="80" w:after="60" w:line="264" w:lineRule="auto"/>
       </w:pPr>
       <w:r>
-        <w:t>UC-O-</w:t>
-      </w:r>
-      <w:proofErr w:type="gramStart"/>
-      <w:r>
-        <w:t>0</w:t>
+        <w:rPr>
+          <w:lang w:val="en-DE"/>
+        </w:rPr>
+        <w:lastRenderedPageBreak/>
+        <w:t>FR1</w:t>
       </w:r>
       <w:r>
         <w:rPr>
@@ -7326,11 +7443,16 @@
         <w:t>4</w:t>
       </w:r>
       <w:r>
-        <w:t xml:space="preserve">  Edit</w:t>
+        <w:t xml:space="preserve"> </w:t>
       </w:r>
-      <w:proofErr w:type="gramEnd"/>
       <w:r>
-        <w:t xml:space="preserve"> Property Listing</w:t>
+        <w:rPr>
+          <w:lang w:val="en-DE"/>
+        </w:rPr>
+        <w:t>-</w:t>
+      </w:r>
+      <w:r>
+        <w:t xml:space="preserve"> Edit Property Listing</w:t>
       </w:r>
     </w:p>
     <w:tbl>
@@ -7391,15 +7513,16 @@
             <w:r>
               <w:rPr>
                 <w:sz w:val="19"/>
-              </w:rPr>
-              <w:t>UC-O-0</w:t>
-            </w:r>
-            <w:r>
-              <w:rPr>
-                <w:sz w:val="19"/>
                 <w:lang w:val="en-DE"/>
               </w:rPr>
-              <w:t xml:space="preserve">4 </w:t>
+              <w:t>FR14</w:t>
+            </w:r>
+            <w:r>
+              <w:rPr>
+                <w:sz w:val="19"/>
+                <w:lang w:val="en-DE"/>
+              </w:rPr>
+              <w:t xml:space="preserve"> </w:t>
             </w:r>
             <w:r>
               <w:rPr>
@@ -7645,12 +7768,6 @@
                 <w:sz w:val="19"/>
               </w:rPr>
               <w:br/>
-            </w:r>
-            <w:r>
-              <w:rPr>
-                <w:sz w:val="19"/>
-              </w:rPr>
-              <w:lastRenderedPageBreak/>
               <w:t>3. The property owner edits the listing details.</w:t>
             </w:r>
             <w:r>
@@ -7695,7 +7812,6 @@
                 <w:b/>
                 <w:sz w:val="19"/>
               </w:rPr>
-              <w:lastRenderedPageBreak/>
               <w:t>Alternative / Exception Flow</w:t>
             </w:r>
           </w:p>
@@ -7785,11 +7901,10 @@
         <w:spacing w:before="80" w:after="60" w:line="264" w:lineRule="auto"/>
       </w:pPr>
       <w:r>
-        <w:t>UC-O-</w:t>
-      </w:r>
-      <w:proofErr w:type="gramStart"/>
-      <w:r>
-        <w:t>0</w:t>
+        <w:rPr>
+          <w:lang w:val="en-DE"/>
+        </w:rPr>
+        <w:t>FR1</w:t>
       </w:r>
       <w:r>
         <w:rPr>
@@ -7798,11 +7913,16 @@
         <w:t>5</w:t>
       </w:r>
       <w:r>
-        <w:t xml:space="preserve">  Delete</w:t>
+        <w:t xml:space="preserve"> </w:t>
       </w:r>
-      <w:proofErr w:type="gramEnd"/>
       <w:r>
-        <w:t xml:space="preserve"> Property Listing</w:t>
+        <w:rPr>
+          <w:lang w:val="en-DE"/>
+        </w:rPr>
+        <w:t>-</w:t>
+      </w:r>
+      <w:r>
+        <w:t xml:space="preserve"> Delete Property Listing</w:t>
       </w:r>
     </w:p>
     <w:tbl>
@@ -7863,8 +7983,9 @@
             <w:r>
               <w:rPr>
                 <w:sz w:val="19"/>
-              </w:rPr>
-              <w:t>UC-O-0</w:t>
+                <w:lang w:val="en-DE"/>
+              </w:rPr>
+              <w:t>FR1</w:t>
             </w:r>
             <w:r>
               <w:rPr>
@@ -8257,24 +8378,22 @@
         <w:spacing w:before="80" w:after="60" w:line="264" w:lineRule="auto"/>
       </w:pPr>
       <w:r>
-        <w:t>UC-O-</w:t>
+        <w:rPr>
+          <w:lang w:val="en-DE"/>
+        </w:rPr>
+        <w:t>FR16</w:t>
       </w:r>
-      <w:proofErr w:type="gramStart"/>
       <w:r>
-        <w:t>0</w:t>
+        <w:t xml:space="preserve"> </w:t>
       </w:r>
       <w:r>
         <w:rPr>
           <w:lang w:val="en-DE"/>
         </w:rPr>
-        <w:t>6</w:t>
+        <w:t>-</w:t>
       </w:r>
       <w:r>
-        <w:t xml:space="preserve">  View</w:t>
-      </w:r>
-      <w:proofErr w:type="gramEnd"/>
-      <w:r>
-        <w:t xml:space="preserve"> Rental Requests</w:t>
+        <w:t xml:space="preserve"> View Rental Requests</w:t>
       </w:r>
     </w:p>
     <w:tbl>
@@ -8335,8 +8454,9 @@
             <w:r>
               <w:rPr>
                 <w:sz w:val="19"/>
-              </w:rPr>
-              <w:t>UC-O-0</w:t>
+                <w:lang w:val="en-DE"/>
+              </w:rPr>
+              <w:t>FR1</w:t>
             </w:r>
             <w:r>
               <w:rPr>
@@ -8552,6 +8672,7 @@
                 <w:b/>
                 <w:sz w:val="19"/>
               </w:rPr>
+              <w:lastRenderedPageBreak/>
               <w:t>Main Success Flow</w:t>
             </w:r>
           </w:p>
@@ -8715,12 +8836,10 @@
         <w:spacing w:before="80" w:after="60" w:line="264" w:lineRule="auto"/>
       </w:pPr>
       <w:r>
-        <w:lastRenderedPageBreak/>
-        <w:t>UC-O-</w:t>
-      </w:r>
-      <w:proofErr w:type="gramStart"/>
-      <w:r>
-        <w:t>0</w:t>
+        <w:rPr>
+          <w:lang w:val="en-DE"/>
+        </w:rPr>
+        <w:t>FR1</w:t>
       </w:r>
       <w:r>
         <w:rPr>
@@ -8729,11 +8848,16 @@
         <w:t>7</w:t>
       </w:r>
       <w:r>
-        <w:t xml:space="preserve">  Accept</w:t>
+        <w:t xml:space="preserve"> </w:t>
       </w:r>
-      <w:proofErr w:type="gramEnd"/>
       <w:r>
-        <w:t xml:space="preserve"> or Reject Rental Request</w:t>
+        <w:rPr>
+          <w:lang w:val="en-DE"/>
+        </w:rPr>
+        <w:t>-</w:t>
+      </w:r>
+      <w:r>
+        <w:t xml:space="preserve"> Accept or Reject Rental Request</w:t>
       </w:r>
     </w:p>
     <w:tbl>
@@ -8794,8 +8918,9 @@
             <w:r>
               <w:rPr>
                 <w:sz w:val="19"/>
-              </w:rPr>
-              <w:t>UC-O-0</w:t>
+                <w:lang w:val="en-DE"/>
+              </w:rPr>
+              <w:t>FR1</w:t>
             </w:r>
             <w:r>
               <w:rPr>
@@ -9188,11 +9313,10 @@
         <w:spacing w:before="80" w:after="60" w:line="264" w:lineRule="auto"/>
       </w:pPr>
       <w:r>
-        <w:t>UC-O-</w:t>
-      </w:r>
-      <w:proofErr w:type="gramStart"/>
-      <w:r>
-        <w:t>0</w:t>
+        <w:rPr>
+          <w:lang w:val="en-DE"/>
+        </w:rPr>
+        <w:t>FR1</w:t>
       </w:r>
       <w:r>
         <w:rPr>
@@ -9201,11 +9325,16 @@
         <w:t>8</w:t>
       </w:r>
       <w:r>
-        <w:t xml:space="preserve">  Send</w:t>
+        <w:t xml:space="preserve"> </w:t>
       </w:r>
-      <w:proofErr w:type="gramEnd"/>
       <w:r>
-        <w:t xml:space="preserve"> Message to Tenant</w:t>
+        <w:rPr>
+          <w:lang w:val="en-DE"/>
+        </w:rPr>
+        <w:t>-</w:t>
+      </w:r>
+      <w:r>
+        <w:t xml:space="preserve"> Send Message to Tenant</w:t>
       </w:r>
     </w:p>
     <w:tbl>
@@ -9266,15 +9395,16 @@
             <w:r>
               <w:rPr>
                 <w:sz w:val="19"/>
-              </w:rPr>
-              <w:t>UC-O-</w:t>
-            </w:r>
-            <w:r>
-              <w:rPr>
-                <w:sz w:val="19"/>
                 <w:lang w:val="en-DE"/>
               </w:rPr>
-              <w:t xml:space="preserve">08 </w:t>
+              <w:t>FR1</w:t>
+            </w:r>
+            <w:r>
+              <w:rPr>
+                <w:sz w:val="19"/>
+                <w:lang w:val="en-DE"/>
+              </w:rPr>
+              <w:t xml:space="preserve">8 </w:t>
             </w:r>
             <w:r>
               <w:rPr>
@@ -9656,13 +9786,17 @@
         </w:rPr>
       </w:pPr>
       <w:r>
-        <w:t>UC-O-</w:t>
+        <w:rPr>
+          <w:lang w:val="en-DE"/>
+        </w:rPr>
+        <w:lastRenderedPageBreak/>
+        <w:t>FR19 -</w:t>
       </w:r>
       <w:r>
         <w:rPr>
           <w:lang w:val="en-DE"/>
         </w:rPr>
-        <w:t>09 View Booking History</w:t>
+        <w:t xml:space="preserve"> View Booking History</w:t>
       </w:r>
     </w:p>
     <w:tbl>
@@ -9728,16 +9862,17 @@
               <w:rPr>
                 <w:sz w:val="19"/>
                 <w:szCs w:val="19"/>
-              </w:rPr>
-              <w:t>UC-O-</w:t>
-            </w:r>
-            <w:r>
-              <w:rPr>
-                <w:sz w:val="19"/>
-                <w:szCs w:val="19"/>
                 <w:lang w:val="en-DE"/>
               </w:rPr>
-              <w:t xml:space="preserve">09 </w:t>
+              <w:t>FR1</w:t>
+            </w:r>
+            <w:r>
+              <w:rPr>
+                <w:sz w:val="19"/>
+                <w:szCs w:val="19"/>
+                <w:lang w:val="en-DE"/>
+              </w:rPr>
+              <w:t xml:space="preserve">9 </w:t>
             </w:r>
             <w:r>
               <w:rPr>
@@ -9957,7 +10092,6 @@
                 <w:b/>
                 <w:sz w:val="19"/>
               </w:rPr>
-              <w:lastRenderedPageBreak/>
               <w:t>Main Success Flow</w:t>
             </w:r>
           </w:p>
@@ -10150,13 +10284,16 @@
         </w:rPr>
       </w:pPr>
       <w:r>
-        <w:t>UC-O-</w:t>
+        <w:rPr>
+          <w:lang w:val="en-DE"/>
+        </w:rPr>
+        <w:t>FR20 -</w:t>
       </w:r>
       <w:r>
         <w:rPr>
           <w:lang w:val="en-DE"/>
         </w:rPr>
-        <w:t>10 Mark Property as Unavailable or Rented</w:t>
+        <w:t xml:space="preserve"> Mark Property as Unavailable or Rented</w:t>
       </w:r>
     </w:p>
     <w:tbl>
@@ -10222,16 +10359,17 @@
               <w:rPr>
                 <w:sz w:val="19"/>
                 <w:szCs w:val="19"/>
-              </w:rPr>
-              <w:t>UC-O-</w:t>
-            </w:r>
-            <w:r>
-              <w:rPr>
-                <w:sz w:val="19"/>
-                <w:szCs w:val="19"/>
                 <w:lang w:val="en-DE"/>
               </w:rPr>
-              <w:t xml:space="preserve">10 </w:t>
+              <w:t>FR20</w:t>
+            </w:r>
+            <w:r>
+              <w:rPr>
+                <w:sz w:val="19"/>
+                <w:szCs w:val="19"/>
+                <w:lang w:val="en-DE"/>
+              </w:rPr>
+              <w:t xml:space="preserve"> </w:t>
             </w:r>
             <w:r>
               <w:rPr>
@@ -10662,11 +10800,10 @@
         <w:spacing w:before="80" w:after="60" w:line="264" w:lineRule="auto"/>
       </w:pPr>
       <w:r>
-        <w:t>UC-A-</w:t>
-      </w:r>
-      <w:proofErr w:type="gramStart"/>
-      <w:r>
-        <w:t>0</w:t>
+        <w:rPr>
+          <w:lang w:val="en-DE"/>
+        </w:rPr>
+        <w:t>FR2</w:t>
       </w:r>
       <w:r>
         <w:rPr>
@@ -10675,11 +10812,16 @@
         <w:t>1</w:t>
       </w:r>
       <w:r>
-        <w:t xml:space="preserve">  Edit</w:t>
+        <w:t xml:space="preserve"> </w:t>
       </w:r>
-      <w:proofErr w:type="gramEnd"/>
       <w:r>
-        <w:t xml:space="preserve"> User Accounts</w:t>
+        <w:rPr>
+          <w:lang w:val="en-DE"/>
+        </w:rPr>
+        <w:t>-</w:t>
+      </w:r>
+      <w:r>
+        <w:t xml:space="preserve"> Edit User Accounts</w:t>
       </w:r>
     </w:p>
     <w:tbl>
@@ -10740,15 +10882,16 @@
             <w:r>
               <w:rPr>
                 <w:sz w:val="19"/>
-              </w:rPr>
-              <w:t>UC-A-0</w:t>
-            </w:r>
-            <w:r>
-              <w:rPr>
-                <w:sz w:val="19"/>
                 <w:lang w:val="en-DE"/>
               </w:rPr>
-              <w:t xml:space="preserve">1 </w:t>
+              <w:t>FR21</w:t>
+            </w:r>
+            <w:r>
+              <w:rPr>
+                <w:sz w:val="19"/>
+                <w:lang w:val="en-DE"/>
+              </w:rPr>
+              <w:t xml:space="preserve"> </w:t>
             </w:r>
             <w:r>
               <w:rPr>
@@ -10904,6 +11047,7 @@
                 <w:b/>
                 <w:sz w:val="19"/>
               </w:rPr>
+              <w:lastRenderedPageBreak/>
               <w:t>Preconditions</w:t>
             </w:r>
           </w:p>
@@ -11098,7 +11242,6 @@
                 <w:b/>
                 <w:sz w:val="19"/>
               </w:rPr>
-              <w:lastRenderedPageBreak/>
               <w:t>Postconditions</w:t>
             </w:r>
           </w:p>
@@ -11135,11 +11278,10 @@
         <w:spacing w:before="80" w:after="60" w:line="264" w:lineRule="auto"/>
       </w:pPr>
       <w:r>
-        <w:t>UC-A-</w:t>
-      </w:r>
-      <w:proofErr w:type="gramStart"/>
-      <w:r>
-        <w:t>0</w:t>
+        <w:rPr>
+          <w:lang w:val="en-DE"/>
+        </w:rPr>
+        <w:t>FR2</w:t>
       </w:r>
       <w:r>
         <w:rPr>
@@ -11148,11 +11290,16 @@
         <w:t>2</w:t>
       </w:r>
       <w:r>
-        <w:t xml:space="preserve">  Delete</w:t>
+        <w:t xml:space="preserve"> </w:t>
       </w:r>
-      <w:proofErr w:type="gramEnd"/>
       <w:r>
-        <w:t xml:space="preserve"> User Accounts</w:t>
+        <w:rPr>
+          <w:lang w:val="en-DE"/>
+        </w:rPr>
+        <w:t>-</w:t>
+      </w:r>
+      <w:r>
+        <w:t xml:space="preserve"> Delete User Accounts</w:t>
       </w:r>
     </w:p>
     <w:tbl>
@@ -11213,8 +11360,9 @@
             <w:r>
               <w:rPr>
                 <w:sz w:val="19"/>
-              </w:rPr>
-              <w:t>UC-A-0</w:t>
+                <w:lang w:val="en-DE"/>
+              </w:rPr>
+              <w:t>FR2</w:t>
             </w:r>
             <w:r>
               <w:rPr>
@@ -11614,11 +11762,10 @@
         <w:spacing w:before="80" w:after="60" w:line="264" w:lineRule="auto"/>
       </w:pPr>
       <w:r>
-        <w:t>UC-A-</w:t>
-      </w:r>
-      <w:proofErr w:type="gramStart"/>
-      <w:r>
-        <w:t>0</w:t>
+        <w:rPr>
+          <w:lang w:val="en-DE"/>
+        </w:rPr>
+        <w:t>FR2</w:t>
       </w:r>
       <w:r>
         <w:rPr>
@@ -11627,11 +11774,16 @@
         <w:t>3</w:t>
       </w:r>
       <w:r>
-        <w:t xml:space="preserve">  Monitor</w:t>
+        <w:t xml:space="preserve"> </w:t>
       </w:r>
-      <w:proofErr w:type="gramEnd"/>
       <w:r>
-        <w:t xml:space="preserve"> Rental Transactions</w:t>
+        <w:rPr>
+          <w:lang w:val="en-DE"/>
+        </w:rPr>
+        <w:t>-</w:t>
+      </w:r>
+      <w:r>
+        <w:t xml:space="preserve"> Monitor Rental Transactions</w:t>
       </w:r>
     </w:p>
     <w:tbl>
@@ -11692,8 +11844,9 @@
             <w:r>
               <w:rPr>
                 <w:sz w:val="19"/>
-              </w:rPr>
-              <w:t>UC-A-0</w:t>
+                <w:lang w:val="en-DE"/>
+              </w:rPr>
+              <w:t>FR2</w:t>
             </w:r>
             <w:r>
               <w:rPr>
@@ -11983,6 +12136,7 @@
                 <w:b/>
                 <w:sz w:val="19"/>
               </w:rPr>
+              <w:lastRenderedPageBreak/>
               <w:t>Alternative / Exception Flow</w:t>
             </w:r>
           </w:p>
@@ -12075,11 +12229,10 @@
         </w:rPr>
       </w:pPr>
       <w:r>
-        <w:t>UC-A-</w:t>
-      </w:r>
-      <w:proofErr w:type="gramStart"/>
-      <w:r>
-        <w:t>0</w:t>
+        <w:rPr>
+          <w:lang w:val="en-DE"/>
+        </w:rPr>
+        <w:t>FR2</w:t>
       </w:r>
       <w:r>
         <w:rPr>
@@ -12088,11 +12241,16 @@
         <w:t>4</w:t>
       </w:r>
       <w:r>
-        <w:t xml:space="preserve">  View</w:t>
+        <w:t xml:space="preserve"> </w:t>
       </w:r>
-      <w:proofErr w:type="gramEnd"/>
       <w:r>
-        <w:t xml:space="preserve"> System Reports</w:t>
+        <w:rPr>
+          <w:lang w:val="en-DE"/>
+        </w:rPr>
+        <w:t>-</w:t>
+      </w:r>
+      <w:r>
+        <w:t xml:space="preserve"> View System Reports</w:t>
       </w:r>
       <w:r>
         <w:rPr>
@@ -12162,15 +12320,16 @@
             <w:r>
               <w:rPr>
                 <w:sz w:val="19"/>
-              </w:rPr>
-              <w:t>UC-A-0</w:t>
-            </w:r>
-            <w:r>
-              <w:rPr>
-                <w:sz w:val="19"/>
                 <w:lang w:val="en-DE"/>
               </w:rPr>
-              <w:t xml:space="preserve">4 </w:t>
+              <w:t>FR24</w:t>
+            </w:r>
+            <w:r>
+              <w:rPr>
+                <w:sz w:val="19"/>
+                <w:lang w:val="en-DE"/>
+              </w:rPr>
+              <w:t xml:space="preserve"> </w:t>
             </w:r>
             <w:r>
               <w:rPr>
@@ -12280,7 +12439,6 @@
                 <w:b/>
                 <w:sz w:val="19"/>
               </w:rPr>
-              <w:lastRenderedPageBreak/>
               <w:t>Goal</w:t>
             </w:r>
           </w:p>
@@ -12530,11 +12688,10 @@
         <w:spacing w:before="80" w:after="60" w:line="264" w:lineRule="auto"/>
       </w:pPr>
       <w:r>
-        <w:t>UC-A-</w:t>
-      </w:r>
-      <w:proofErr w:type="gramStart"/>
-      <w:r>
-        <w:t>0</w:t>
+        <w:rPr>
+          <w:lang w:val="en-DE"/>
+        </w:rPr>
+        <w:t>FR2</w:t>
       </w:r>
       <w:r>
         <w:rPr>
@@ -12543,11 +12700,16 @@
         <w:t>5</w:t>
       </w:r>
       <w:r>
-        <w:t xml:space="preserve">  Remove</w:t>
+        <w:t xml:space="preserve"> </w:t>
       </w:r>
-      <w:proofErr w:type="gramEnd"/>
       <w:r>
-        <w:t xml:space="preserve"> Inappropriate Listings</w:t>
+        <w:rPr>
+          <w:lang w:val="en-DE"/>
+        </w:rPr>
+        <w:t>-</w:t>
+      </w:r>
+      <w:r>
+        <w:t xml:space="preserve"> Remove Inappropriate Listings</w:t>
       </w:r>
     </w:p>
     <w:tbl>
@@ -12608,8 +12770,9 @@
             <w:r>
               <w:rPr>
                 <w:sz w:val="19"/>
-              </w:rPr>
-              <w:t>UC-A-0</w:t>
+                <w:lang w:val="en-DE"/>
+              </w:rPr>
+              <w:t>FR2</w:t>
             </w:r>
             <w:r>
               <w:rPr>
@@ -12998,11 +13161,11 @@
         </w:rPr>
       </w:pPr>
       <w:r>
-        <w:t>UC-A-</w:t>
-      </w:r>
-      <w:proofErr w:type="gramStart"/>
-      <w:r>
-        <w:t>0</w:t>
+        <w:rPr>
+          <w:lang w:val="en-DE"/>
+        </w:rPr>
+        <w:lastRenderedPageBreak/>
+        <w:t>FR2</w:t>
       </w:r>
       <w:r>
         <w:rPr>
@@ -13011,11 +13174,16 @@
         <w:t>6</w:t>
       </w:r>
       <w:r>
-        <w:t xml:space="preserve">  Manage</w:t>
+        <w:t xml:space="preserve"> </w:t>
       </w:r>
-      <w:proofErr w:type="gramEnd"/>
       <w:r>
-        <w:t xml:space="preserve"> Disputes</w:t>
+        <w:rPr>
+          <w:lang w:val="en-DE"/>
+        </w:rPr>
+        <w:t>-</w:t>
+      </w:r>
+      <w:r>
+        <w:t xml:space="preserve"> Manage Disputes</w:t>
       </w:r>
       <w:r>
         <w:rPr>
@@ -13090,8 +13258,9 @@
                 <w:rFonts w:asciiTheme="majorHAnsi" w:hAnsiTheme="majorHAnsi" w:cstheme="majorHAnsi"/>
                 <w:sz w:val="19"/>
                 <w:szCs w:val="19"/>
-              </w:rPr>
-              <w:t>UC-A-0</w:t>
+                <w:lang w:val="en-DE"/>
+              </w:rPr>
+              <w:t>FR2</w:t>
             </w:r>
             <w:r>
               <w:rPr>
@@ -13502,14 +13671,6 @@
                 <w:szCs w:val="19"/>
               </w:rPr>
               <w:br/>
-            </w:r>
-            <w:r>
-              <w:rPr>
-                <w:rFonts w:asciiTheme="majorHAnsi" w:hAnsiTheme="majorHAnsi" w:cstheme="majorHAnsi"/>
-                <w:sz w:val="19"/>
-                <w:szCs w:val="19"/>
-              </w:rPr>
-              <w:lastRenderedPageBreak/>
               <w:t xml:space="preserve">4. The administrator reviews disputes submitted by users or views current system settings. </w:t>
             </w:r>
             <w:r>
@@ -13558,7 +13719,6 @@
                 <w:b/>
                 <w:sz w:val="19"/>
               </w:rPr>
-              <w:lastRenderedPageBreak/>
               <w:t>Alternative / Exception Flow</w:t>
             </w:r>
           </w:p>
@@ -13753,14 +13913,10 @@
         <w:spacing w:before="80" w:after="60" w:line="264" w:lineRule="auto"/>
       </w:pPr>
       <w:r>
-        <w:t>UC-A-</w:t>
-      </w:r>
-      <w:proofErr w:type="gramStart"/>
-      <w:r>
         <w:rPr>
           <w:lang w:val="en-DE"/>
         </w:rPr>
-        <w:t>0</w:t>
+        <w:t>FR2</w:t>
       </w:r>
       <w:r>
         <w:rPr>
@@ -13769,11 +13925,16 @@
         <w:t>7</w:t>
       </w:r>
       <w:r>
-        <w:t xml:space="preserve">  Restore</w:t>
+        <w:t xml:space="preserve"> </w:t>
       </w:r>
-      <w:proofErr w:type="gramEnd"/>
       <w:r>
-        <w:t xml:space="preserve"> User Accounts</w:t>
+        <w:rPr>
+          <w:lang w:val="en-DE"/>
+        </w:rPr>
+        <w:t>-</w:t>
+      </w:r>
+      <w:r>
+        <w:t xml:space="preserve"> Restore User Accounts</w:t>
       </w:r>
     </w:p>
     <w:tbl>
@@ -13834,15 +13995,9 @@
             <w:r>
               <w:rPr>
                 <w:sz w:val="19"/>
-              </w:rPr>
-              <w:t>UC-A-</w:t>
-            </w:r>
-            <w:r>
-              <w:rPr>
-                <w:sz w:val="19"/>
                 <w:lang w:val="en-DE"/>
               </w:rPr>
-              <w:t>0</w:t>
+              <w:t>FR2</w:t>
             </w:r>
             <w:r>
               <w:rPr>
@@ -14235,21 +14390,22 @@
         <w:spacing w:before="80" w:after="60" w:line="264" w:lineRule="auto"/>
       </w:pPr>
       <w:r>
-        <w:t>UC-A-</w:t>
+        <w:rPr>
+          <w:lang w:val="en-DE"/>
+        </w:rPr>
+        <w:t>FR28</w:t>
       </w:r>
-      <w:proofErr w:type="gramStart"/>
+      <w:r>
+        <w:t xml:space="preserve"> </w:t>
+      </w:r>
       <w:r>
         <w:rPr>
           <w:lang w:val="en-DE"/>
         </w:rPr>
-        <w:t>08</w:t>
+        <w:t>-</w:t>
       </w:r>
       <w:r>
-        <w:t xml:space="preserve">  Suspend</w:t>
-      </w:r>
-      <w:proofErr w:type="gramEnd"/>
-      <w:r>
-        <w:t xml:space="preserve"> User Accounts</w:t>
+        <w:t xml:space="preserve"> Suspend User Accounts</w:t>
       </w:r>
     </w:p>
     <w:tbl>
@@ -14310,15 +14466,16 @@
             <w:r>
               <w:rPr>
                 <w:sz w:val="19"/>
-              </w:rPr>
-              <w:t>UC-A-</w:t>
-            </w:r>
-            <w:r>
-              <w:rPr>
-                <w:sz w:val="19"/>
                 <w:lang w:val="en-DE"/>
               </w:rPr>
-              <w:t>08</w:t>
+              <w:t>FR2</w:t>
+            </w:r>
+            <w:r>
+              <w:rPr>
+                <w:sz w:val="19"/>
+                <w:lang w:val="en-DE"/>
+              </w:rPr>
+              <w:t>8</w:t>
             </w:r>
             <w:r>
               <w:rPr>
@@ -14534,6 +14691,7 @@
                 <w:b/>
                 <w:sz w:val="19"/>
               </w:rPr>
+              <w:lastRenderedPageBreak/>
               <w:t>Main Success Flow</w:t>
             </w:r>
           </w:p>
@@ -14721,31 +14879,34 @@
         </w:rPr>
       </w:pPr>
       <w:r>
-        <w:lastRenderedPageBreak/>
-        <w:t>UC-A-</w:t>
-      </w:r>
-      <w:proofErr w:type="gramStart"/>
-      <w:r>
         <w:rPr>
           <w:lang w:val="en-DE"/>
         </w:rPr>
-        <w:t>09</w:t>
-      </w:r>
-      <w:r>
-        <w:t xml:space="preserve">  </w:t>
+        <w:t>FR2</w:t>
       </w:r>
       <w:r>
         <w:rPr>
           <w:lang w:val="en-DE"/>
         </w:rPr>
-        <w:t>Verify</w:t>
+        <w:t>9</w:t>
       </w:r>
-      <w:proofErr w:type="gramEnd"/>
+      <w:r>
+        <w:t xml:space="preserve"> </w:t>
+      </w:r>
       <w:r>
         <w:rPr>
           <w:lang w:val="en-DE"/>
         </w:rPr>
-        <w:t xml:space="preserve"> and Approve property listings</w:t>
+        <w:t>-</w:t>
+      </w:r>
+      <w:r>
+        <w:t xml:space="preserve"> </w:t>
+      </w:r>
+      <w:r>
+        <w:rPr>
+          <w:lang w:val="en-DE"/>
+        </w:rPr>
+        <w:t>Verify and Approve property listings</w:t>
       </w:r>
     </w:p>
     <w:tbl>
@@ -14812,16 +14973,17 @@
               <w:rPr>
                 <w:sz w:val="19"/>
                 <w:szCs w:val="19"/>
-              </w:rPr>
-              <w:t>UC-A-</w:t>
-            </w:r>
-            <w:r>
-              <w:rPr>
-                <w:sz w:val="19"/>
-                <w:szCs w:val="19"/>
                 <w:lang w:val="en-DE"/>
               </w:rPr>
-              <w:t>09</w:t>
+              <w:t>FR2</w:t>
+            </w:r>
+            <w:r>
+              <w:rPr>
+                <w:sz w:val="19"/>
+                <w:szCs w:val="19"/>
+                <w:lang w:val="en-DE"/>
+              </w:rPr>
+              <w:t>9</w:t>
             </w:r>
             <w:r>
               <w:rPr>
@@ -15263,24 +15425,22 @@
         <w:spacing w:before="80" w:after="60" w:line="264" w:lineRule="auto"/>
       </w:pPr>
       <w:r>
-        <w:t>UC-M-</w:t>
+        <w:rPr>
+          <w:lang w:val="en-DE"/>
+        </w:rPr>
+        <w:t>FR30</w:t>
       </w:r>
-      <w:proofErr w:type="gramStart"/>
       <w:r>
-        <w:t>0</w:t>
+        <w:t xml:space="preserve"> </w:t>
       </w:r>
       <w:r>
         <w:rPr>
           <w:lang w:val="en-DE"/>
         </w:rPr>
-        <w:t>1</w:t>
+        <w:t>-</w:t>
       </w:r>
       <w:r>
-        <w:t xml:space="preserve">  Monitor</w:t>
-      </w:r>
-      <w:proofErr w:type="gramEnd"/>
-      <w:r>
-        <w:t xml:space="preserve"> Rental Requests</w:t>
+        <w:t xml:space="preserve"> Monitor Rental Requests</w:t>
       </w:r>
     </w:p>
     <w:tbl>
@@ -15341,15 +15501,16 @@
             <w:r>
               <w:rPr>
                 <w:sz w:val="19"/>
-              </w:rPr>
-              <w:t>UC-M-0</w:t>
-            </w:r>
-            <w:r>
-              <w:rPr>
-                <w:sz w:val="19"/>
                 <w:lang w:val="en-DE"/>
               </w:rPr>
-              <w:t xml:space="preserve">1 </w:t>
+              <w:t>FR30</w:t>
+            </w:r>
+            <w:r>
+              <w:rPr>
+                <w:sz w:val="19"/>
+                <w:lang w:val="en-DE"/>
+              </w:rPr>
+              <w:t xml:space="preserve"> </w:t>
             </w:r>
             <w:r>
               <w:rPr>
@@ -15632,6 +15793,7 @@
                 <w:b/>
                 <w:sz w:val="19"/>
               </w:rPr>
+              <w:lastRenderedPageBreak/>
               <w:t>Alternative / Exception Flow</w:t>
             </w:r>
           </w:p>
@@ -15721,24 +15883,22 @@
         <w:spacing w:before="80" w:after="60" w:line="264" w:lineRule="auto"/>
       </w:pPr>
       <w:r>
-        <w:t>UC-M-</w:t>
+        <w:rPr>
+          <w:lang w:val="en-DE"/>
+        </w:rPr>
+        <w:t>FR31</w:t>
       </w:r>
-      <w:proofErr w:type="gramStart"/>
       <w:r>
-        <w:t>0</w:t>
+        <w:t xml:space="preserve"> </w:t>
       </w:r>
       <w:r>
         <w:rPr>
           <w:lang w:val="en-DE"/>
         </w:rPr>
-        <w:t>2</w:t>
+        <w:t>-</w:t>
       </w:r>
       <w:r>
-        <w:t xml:space="preserve">  Generate</w:t>
-      </w:r>
-      <w:proofErr w:type="gramEnd"/>
-      <w:r>
-        <w:t xml:space="preserve"> Management Reports</w:t>
+        <w:t xml:space="preserve"> Generate Management Reports</w:t>
       </w:r>
     </w:p>
     <w:tbl>
@@ -15799,15 +15959,16 @@
             <w:r>
               <w:rPr>
                 <w:sz w:val="19"/>
-              </w:rPr>
-              <w:t>UC-M-0</w:t>
-            </w:r>
-            <w:r>
-              <w:rPr>
-                <w:sz w:val="19"/>
                 <w:lang w:val="en-DE"/>
               </w:rPr>
-              <w:t xml:space="preserve">2 </w:t>
+              <w:t>FR31</w:t>
+            </w:r>
+            <w:r>
+              <w:rPr>
+                <w:sz w:val="19"/>
+                <w:lang w:val="en-DE"/>
+              </w:rPr>
+              <w:t xml:space="preserve"> </w:t>
             </w:r>
             <w:r>
               <w:rPr>
@@ -15963,7 +16124,6 @@
                 <w:b/>
                 <w:sz w:val="19"/>
               </w:rPr>
-              <w:lastRenderedPageBreak/>
               <w:t>Preconditions</w:t>
             </w:r>
           </w:p>
@@ -16187,24 +16347,22 @@
         <w:spacing w:before="80" w:after="60" w:line="264" w:lineRule="auto"/>
       </w:pPr>
       <w:r>
-        <w:t>UC-M-</w:t>
+        <w:rPr>
+          <w:lang w:val="en-DE"/>
+        </w:rPr>
+        <w:t>FR32</w:t>
       </w:r>
-      <w:proofErr w:type="gramStart"/>
       <w:r>
-        <w:t>0</w:t>
+        <w:t xml:space="preserve"> </w:t>
       </w:r>
       <w:r>
         <w:rPr>
           <w:lang w:val="en-DE"/>
         </w:rPr>
-        <w:t>3</w:t>
+        <w:t>-</w:t>
       </w:r>
       <w:r>
-        <w:t xml:space="preserve">  Approve</w:t>
-      </w:r>
-      <w:proofErr w:type="gramEnd"/>
-      <w:r>
-        <w:t xml:space="preserve"> Large Discounts and Promotions</w:t>
+        <w:t xml:space="preserve"> Approve Large Discounts and Promotions</w:t>
       </w:r>
     </w:p>
     <w:tbl>
@@ -16265,15 +16423,16 @@
             <w:r>
               <w:rPr>
                 <w:sz w:val="19"/>
-              </w:rPr>
-              <w:t>UC-M-0</w:t>
-            </w:r>
-            <w:r>
-              <w:rPr>
-                <w:sz w:val="19"/>
                 <w:lang w:val="en-DE"/>
               </w:rPr>
-              <w:t xml:space="preserve">3 </w:t>
+              <w:t>FR32</w:t>
+            </w:r>
+            <w:r>
+              <w:rPr>
+                <w:sz w:val="19"/>
+                <w:lang w:val="en-DE"/>
+              </w:rPr>
+              <w:t xml:space="preserve"> </w:t>
             </w:r>
             <w:r>
               <w:rPr>
@@ -16654,34 +16813,57 @@
           <w:lang w:val="en-DE"/>
         </w:rPr>
       </w:pPr>
+    </w:p>
+    <w:p>
+      <w:pPr>
+        <w:pStyle w:val="Heading2"/>
+        <w:spacing w:before="80" w:after="60" w:line="264" w:lineRule="auto"/>
+        <w:rPr>
+          <w:lang w:val="en-DE"/>
+        </w:rPr>
+      </w:pPr>
+    </w:p>
+    <w:p>
+      <w:pPr>
+        <w:pStyle w:val="Heading2"/>
+        <w:spacing w:before="80" w:after="60" w:line="264" w:lineRule="auto"/>
+        <w:rPr>
+          <w:lang w:val="en-DE"/>
+        </w:rPr>
+      </w:pPr>
+    </w:p>
+    <w:p>
+      <w:pPr>
+        <w:pStyle w:val="Heading2"/>
+        <w:spacing w:before="80" w:after="60" w:line="264" w:lineRule="auto"/>
+        <w:rPr>
+          <w:lang w:val="en-DE"/>
+        </w:rPr>
+      </w:pPr>
+      <w:bookmarkStart w:id="0" w:name="_Hlk225608306"/>
       <w:r>
-        <w:t>UC-M-</w:t>
+        <w:rPr>
+          <w:lang w:val="en-DE"/>
+        </w:rPr>
+        <w:t>FR33</w:t>
       </w:r>
-      <w:proofErr w:type="gramStart"/>
       <w:r>
-        <w:t>0</w:t>
+        <w:t xml:space="preserve"> </w:t>
       </w:r>
       <w:r>
         <w:rPr>
           <w:lang w:val="en-DE"/>
         </w:rPr>
-        <w:t>4</w:t>
+        <w:t>-</w:t>
       </w:r>
       <w:r>
-        <w:t xml:space="preserve">  </w:t>
+        <w:t xml:space="preserve"> </w:t>
       </w:r>
       <w:r>
         <w:rPr>
           <w:lang w:val="en-DE"/>
         </w:rPr>
-        <w:t>Review</w:t>
-      </w:r>
-      <w:proofErr w:type="gramEnd"/>
-      <w:r>
-        <w:rPr>
-          <w:lang w:val="en-DE"/>
-        </w:rPr>
-        <w:t xml:space="preserve"> Complaints and Forward Unresolved Issues</w:t>
+        <w:t>Review Complaints and Forward Unresolved Issues</w:t>
       </w:r>
     </w:p>
     <w:tbl>
@@ -16711,6 +16893,7 @@
             </w:tcMar>
             <w:vAlign w:val="center"/>
           </w:tcPr>
+          <w:bookmarkEnd w:id="0"/>
           <w:p>
             <w:pPr>
               <w:spacing w:line="252" w:lineRule="auto"/>
@@ -16749,8 +16932,9 @@
                 <w:rFonts w:asciiTheme="majorHAnsi" w:hAnsiTheme="majorHAnsi" w:cstheme="majorHAnsi"/>
                 <w:sz w:val="19"/>
                 <w:szCs w:val="19"/>
-              </w:rPr>
-              <w:t>UC-M-0</w:t>
+                <w:lang w:val="en-DE"/>
+              </w:rPr>
+              <w:t>FR33</w:t>
             </w:r>
             <w:r>
               <w:rPr>
@@ -16759,7 +16943,7 @@
                 <w:szCs w:val="19"/>
                 <w:lang w:val="en-DE"/>
               </w:rPr>
-              <w:t xml:space="preserve">4 </w:t>
+              <w:t xml:space="preserve"> </w:t>
             </w:r>
             <w:r>
               <w:rPr>
@@ -17201,7 +17385,6 @@
                 <w:b/>
                 <w:sz w:val="19"/>
               </w:rPr>
-              <w:lastRenderedPageBreak/>
               <w:t>Alternative / Exception Flow</w:t>
             </w:r>
           </w:p>
@@ -17313,25 +17496,24 @@
         <w:pStyle w:val="Heading2"/>
         <w:spacing w:before="80" w:after="60" w:line="264" w:lineRule="auto"/>
       </w:pPr>
+      <w:bookmarkStart w:id="1" w:name="_Hlk225608330"/>
       <w:r>
-        <w:t>UC-F-</w:t>
+        <w:rPr>
+          <w:lang w:val="en-DE"/>
+        </w:rPr>
+        <w:t>FR34</w:t>
       </w:r>
-      <w:proofErr w:type="gramStart"/>
       <w:r>
-        <w:t>0</w:t>
+        <w:t xml:space="preserve"> </w:t>
       </w:r>
       <w:r>
         <w:rPr>
           <w:lang w:val="en-DE"/>
         </w:rPr>
-        <w:t>1</w:t>
+        <w:t>-</w:t>
       </w:r>
       <w:r>
-        <w:t xml:space="preserve">  View</w:t>
-      </w:r>
-      <w:proofErr w:type="gramEnd"/>
-      <w:r>
-        <w:t xml:space="preserve"> Transaction History</w:t>
+        <w:t xml:space="preserve"> View Transaction History</w:t>
       </w:r>
     </w:p>
     <w:tbl>
@@ -17361,6 +17543,7 @@
             </w:tcMar>
             <w:vAlign w:val="center"/>
           </w:tcPr>
+          <w:bookmarkEnd w:id="1"/>
           <w:p>
             <w:pPr>
               <w:spacing w:line="252" w:lineRule="auto"/>
@@ -17392,15 +17575,16 @@
             <w:r>
               <w:rPr>
                 <w:sz w:val="19"/>
-              </w:rPr>
-              <w:t>UC-F-0</w:t>
-            </w:r>
-            <w:r>
-              <w:rPr>
-                <w:sz w:val="19"/>
                 <w:lang w:val="en-DE"/>
               </w:rPr>
-              <w:t xml:space="preserve">1 </w:t>
+              <w:t>FR34</w:t>
+            </w:r>
+            <w:r>
+              <w:rPr>
+                <w:sz w:val="19"/>
+                <w:lang w:val="en-DE"/>
+              </w:rPr>
+              <w:t xml:space="preserve"> </w:t>
             </w:r>
             <w:r>
               <w:rPr>
@@ -17771,25 +17955,25 @@
         <w:pStyle w:val="Heading2"/>
         <w:spacing w:before="80" w:after="60" w:line="264" w:lineRule="auto"/>
       </w:pPr>
+      <w:bookmarkStart w:id="2" w:name="_Hlk225608347"/>
       <w:r>
-        <w:t>UC-F-</w:t>
+        <w:rPr>
+          <w:lang w:val="en-DE"/>
+        </w:rPr>
+        <w:lastRenderedPageBreak/>
+        <w:t>FR35</w:t>
       </w:r>
-      <w:proofErr w:type="gramStart"/>
       <w:r>
-        <w:t>0</w:t>
+        <w:t xml:space="preserve"> </w:t>
       </w:r>
       <w:r>
         <w:rPr>
           <w:lang w:val="en-DE"/>
         </w:rPr>
-        <w:t>2</w:t>
+        <w:t>-</w:t>
       </w:r>
       <w:r>
-        <w:t xml:space="preserve">  Monitor</w:t>
-      </w:r>
-      <w:proofErr w:type="gramEnd"/>
-      <w:r>
-        <w:t xml:space="preserve"> Payment Process and Security</w:t>
+        <w:t xml:space="preserve"> Monitor Payment Process and Security</w:t>
       </w:r>
     </w:p>
     <w:tbl>
@@ -17819,6 +18003,7 @@
             </w:tcMar>
             <w:vAlign w:val="center"/>
           </w:tcPr>
+          <w:bookmarkEnd w:id="2"/>
           <w:p>
             <w:pPr>
               <w:spacing w:line="252" w:lineRule="auto"/>
@@ -17850,15 +18035,16 @@
             <w:r>
               <w:rPr>
                 <w:sz w:val="19"/>
-              </w:rPr>
-              <w:t>UC-F-0</w:t>
-            </w:r>
-            <w:r>
-              <w:rPr>
-                <w:sz w:val="19"/>
                 <w:lang w:val="en-DE"/>
               </w:rPr>
-              <w:t xml:space="preserve">2 </w:t>
+              <w:t>FR35</w:t>
+            </w:r>
+            <w:r>
+              <w:rPr>
+                <w:sz w:val="19"/>
+                <w:lang w:val="en-DE"/>
+              </w:rPr>
+              <w:t xml:space="preserve"> </w:t>
             </w:r>
             <w:r>
               <w:rPr>
@@ -18223,23 +18409,26 @@
         </w:tc>
       </w:tr>
     </w:tbl>
-    <w:p/>
-    <w:p/>
-    <w:p/>
+    <w:p>
+      <w:pPr>
+        <w:pStyle w:val="Heading2"/>
+        <w:spacing w:before="80" w:after="60" w:line="264" w:lineRule="auto"/>
+        <w:rPr>
+          <w:lang w:val="en-DE"/>
+        </w:rPr>
+      </w:pPr>
+    </w:p>
     <w:p>
       <w:pPr>
         <w:pStyle w:val="Heading2"/>
         <w:spacing w:before="80" w:after="60" w:line="264" w:lineRule="auto"/>
       </w:pPr>
-      <w:r>
-        <w:lastRenderedPageBreak/>
-        <w:t>UC-F-0</w:t>
-      </w:r>
+      <w:bookmarkStart w:id="3" w:name="_Hlk225608364"/>
       <w:r>
         <w:rPr>
           <w:lang w:val="en-DE"/>
         </w:rPr>
-        <w:t>3</w:t>
+        <w:t>FR36 -</w:t>
       </w:r>
       <w:r>
         <w:t xml:space="preserve"> Communicate Payment Issues with Tenants and Owners</w:t>
@@ -18272,6 +18461,7 @@
             </w:tcMar>
             <w:vAlign w:val="center"/>
           </w:tcPr>
+          <w:bookmarkEnd w:id="3"/>
           <w:p>
             <w:pPr>
               <w:spacing w:line="252" w:lineRule="auto"/>
@@ -18303,15 +18493,16 @@
             <w:r>
               <w:rPr>
                 <w:sz w:val="19"/>
-              </w:rPr>
-              <w:t>UC-F-0</w:t>
-            </w:r>
-            <w:r>
-              <w:rPr>
-                <w:sz w:val="19"/>
                 <w:lang w:val="en-DE"/>
               </w:rPr>
-              <w:t xml:space="preserve">3 </w:t>
+              <w:t>FR36</w:t>
+            </w:r>
+            <w:r>
+              <w:rPr>
+                <w:sz w:val="19"/>
+                <w:lang w:val="en-DE"/>
+              </w:rPr>
+              <w:t xml:space="preserve"> </w:t>
             </w:r>
             <w:r>
               <w:rPr>
@@ -18699,14 +18890,12 @@
           <w:lang w:val="en-DE"/>
         </w:rPr>
       </w:pPr>
-      <w:r>
-        <w:t>UC-F-0</w:t>
-      </w:r>
+      <w:bookmarkStart w:id="4" w:name="_Hlk225608381"/>
       <w:r>
         <w:rPr>
           <w:lang w:val="en-DE"/>
         </w:rPr>
-        <w:t>4</w:t>
+        <w:t>FR37 -</w:t>
       </w:r>
       <w:r>
         <w:t xml:space="preserve"> </w:t>
@@ -18745,6 +18934,7 @@
             </w:tcMar>
             <w:vAlign w:val="center"/>
           </w:tcPr>
+          <w:bookmarkEnd w:id="4"/>
           <w:p>
             <w:pPr>
               <w:spacing w:line="252" w:lineRule="auto"/>
@@ -18784,16 +18974,17 @@
               <w:rPr>
                 <w:sz w:val="19"/>
                 <w:szCs w:val="19"/>
-              </w:rPr>
-              <w:t>UC-F-0</w:t>
-            </w:r>
-            <w:r>
-              <w:rPr>
-                <w:sz w:val="19"/>
-                <w:szCs w:val="19"/>
                 <w:lang w:val="en-DE"/>
               </w:rPr>
-              <w:t xml:space="preserve">4 </w:t>
+              <w:t>FR37</w:t>
+            </w:r>
+            <w:r>
+              <w:rPr>
+                <w:sz w:val="19"/>
+                <w:szCs w:val="19"/>
+                <w:lang w:val="en-DE"/>
+              </w:rPr>
+              <w:t xml:space="preserve"> </w:t>
             </w:r>
             <w:r>
               <w:rPr>
@@ -19074,6 +19265,13 @@
                 <w:szCs w:val="19"/>
               </w:rPr>
               <w:br/>
+            </w:r>
+            <w:r>
+              <w:rPr>
+                <w:sz w:val="19"/>
+                <w:szCs w:val="19"/>
+              </w:rPr>
+              <w:lastRenderedPageBreak/>
               <w:t xml:space="preserve">4. The financier selects a refund request for review. </w:t>
             </w:r>
             <w:r>
@@ -19128,6 +19326,7 @@
                 <w:b/>
                 <w:sz w:val="19"/>
               </w:rPr>
+              <w:lastRenderedPageBreak/>
               <w:t>Alternative / Exception Flow</w:t>
             </w:r>
           </w:p>
@@ -19220,8 +19419,6 @@
         </w:tc>
       </w:tr>
     </w:tbl>
-    <w:p/>
-    <w:p/>
     <w:p/>
     <w:p>
       <w:pPr>
@@ -19229,7 +19426,6 @@
         <w:spacing w:before="160" w:after="100" w:line="264" w:lineRule="auto"/>
       </w:pPr>
       <w:r>
-        <w:lastRenderedPageBreak/>
         <w:t>HR</w:t>
       </w:r>
     </w:p>
@@ -19238,25 +19434,24 @@
         <w:pStyle w:val="Heading2"/>
         <w:spacing w:before="80" w:after="60" w:line="264" w:lineRule="auto"/>
       </w:pPr>
+      <w:bookmarkStart w:id="5" w:name="_Hlk225608414"/>
       <w:r>
-        <w:t>UC-HR-</w:t>
+        <w:rPr>
+          <w:lang w:val="en-DE"/>
+        </w:rPr>
+        <w:t>FR38</w:t>
       </w:r>
-      <w:proofErr w:type="gramStart"/>
       <w:r>
-        <w:t>0</w:t>
+        <w:t xml:space="preserve"> </w:t>
       </w:r>
       <w:r>
         <w:rPr>
           <w:lang w:val="en-DE"/>
         </w:rPr>
-        <w:t>1</w:t>
+        <w:t>-</w:t>
       </w:r>
       <w:r>
-        <w:t xml:space="preserve">  Manage</w:t>
-      </w:r>
-      <w:proofErr w:type="gramEnd"/>
-      <w:r>
-        <w:t xml:space="preserve"> Complaints</w:t>
+        <w:t xml:space="preserve"> Manage Complaints</w:t>
       </w:r>
     </w:p>
     <w:tbl>
@@ -19286,6 +19481,7 @@
             </w:tcMar>
             <w:vAlign w:val="center"/>
           </w:tcPr>
+          <w:bookmarkEnd w:id="5"/>
           <w:p>
             <w:pPr>
               <w:spacing w:line="252" w:lineRule="auto"/>
@@ -19317,15 +19513,16 @@
             <w:r>
               <w:rPr>
                 <w:sz w:val="19"/>
-              </w:rPr>
-              <w:t>UC-HR-0</w:t>
-            </w:r>
-            <w:r>
-              <w:rPr>
-                <w:sz w:val="19"/>
                 <w:lang w:val="en-DE"/>
               </w:rPr>
-              <w:t xml:space="preserve">1 </w:t>
+              <w:t>FR38</w:t>
+            </w:r>
+            <w:r>
+              <w:rPr>
+                <w:sz w:val="19"/>
+                <w:lang w:val="en-DE"/>
+              </w:rPr>
+              <w:t xml:space="preserve"> </w:t>
             </w:r>
             <w:r>
               <w:rPr>
@@ -19703,25 +19900,24 @@
         <w:pStyle w:val="Heading2"/>
         <w:spacing w:before="80" w:after="60" w:line="264" w:lineRule="auto"/>
       </w:pPr>
+      <w:bookmarkStart w:id="6" w:name="_Hlk225608434"/>
       <w:r>
-        <w:t>UC-HR-</w:t>
+        <w:rPr>
+          <w:lang w:val="en-DE"/>
+        </w:rPr>
+        <w:t>FR39</w:t>
       </w:r>
-      <w:proofErr w:type="gramStart"/>
       <w:r>
-        <w:t>0</w:t>
+        <w:t xml:space="preserve"> </w:t>
       </w:r>
       <w:r>
         <w:rPr>
           <w:lang w:val="en-DE"/>
         </w:rPr>
-        <w:t>2</w:t>
+        <w:t>-</w:t>
       </w:r>
       <w:r>
-        <w:t xml:space="preserve">  Send</w:t>
-      </w:r>
-      <w:proofErr w:type="gramEnd"/>
-      <w:r>
-        <w:t xml:space="preserve"> Notifications and Reminders</w:t>
+        <w:t xml:space="preserve"> Send Notifications and Reminders</w:t>
       </w:r>
     </w:p>
     <w:tbl>
@@ -19751,6 +19947,7 @@
             </w:tcMar>
             <w:vAlign w:val="center"/>
           </w:tcPr>
+          <w:bookmarkEnd w:id="6"/>
           <w:p>
             <w:pPr>
               <w:spacing w:line="252" w:lineRule="auto"/>
@@ -19782,15 +19979,16 @@
             <w:r>
               <w:rPr>
                 <w:sz w:val="19"/>
-              </w:rPr>
-              <w:t>UC-HR-0</w:t>
-            </w:r>
-            <w:r>
-              <w:rPr>
-                <w:sz w:val="19"/>
                 <w:lang w:val="en-DE"/>
               </w:rPr>
-              <w:t xml:space="preserve">2 </w:t>
+              <w:t>FR39</w:t>
+            </w:r>
+            <w:r>
+              <w:rPr>
+                <w:sz w:val="19"/>
+                <w:lang w:val="en-DE"/>
+              </w:rPr>
+              <w:t xml:space="preserve"> </w:t>
             </w:r>
             <w:r>
               <w:rPr>
@@ -20168,25 +20366,24 @@
         <w:pStyle w:val="Heading2"/>
         <w:spacing w:before="80" w:after="60" w:line="264" w:lineRule="auto"/>
       </w:pPr>
+      <w:bookmarkStart w:id="7" w:name="_Hlk225608450"/>
       <w:r>
-        <w:t>UC-HR-</w:t>
+        <w:rPr>
+          <w:lang w:val="en-DE"/>
+        </w:rPr>
+        <w:t>FR40</w:t>
       </w:r>
-      <w:proofErr w:type="gramStart"/>
       <w:r>
-        <w:t>0</w:t>
+        <w:t xml:space="preserve"> </w:t>
       </w:r>
       <w:r>
         <w:rPr>
           <w:lang w:val="en-DE"/>
         </w:rPr>
-        <w:t>3</w:t>
+        <w:t>-</w:t>
       </w:r>
       <w:r>
-        <w:t xml:space="preserve">  Maintain</w:t>
-      </w:r>
-      <w:proofErr w:type="gramEnd"/>
-      <w:r>
-        <w:t xml:space="preserve"> Records of User Issues and Resolutions</w:t>
+        <w:t xml:space="preserve"> Maintain Records of User Issues and Resolutions</w:t>
       </w:r>
     </w:p>
     <w:tbl>
@@ -20216,6 +20413,7 @@
             </w:tcMar>
             <w:vAlign w:val="center"/>
           </w:tcPr>
+          <w:bookmarkEnd w:id="7"/>
           <w:p>
             <w:pPr>
               <w:spacing w:line="252" w:lineRule="auto"/>
@@ -20247,15 +20445,16 @@
             <w:r>
               <w:rPr>
                 <w:sz w:val="19"/>
-              </w:rPr>
-              <w:t>UC-HR-0</w:t>
-            </w:r>
-            <w:r>
-              <w:rPr>
-                <w:sz w:val="19"/>
                 <w:lang w:val="en-DE"/>
               </w:rPr>
-              <w:t xml:space="preserve">3 </w:t>
+              <w:t>FR40</w:t>
+            </w:r>
+            <w:r>
+              <w:rPr>
+                <w:sz w:val="19"/>
+                <w:lang w:val="en-DE"/>
+              </w:rPr>
+              <w:t xml:space="preserve"> </w:t>
             </w:r>
             <w:r>
               <w:rPr>
@@ -20464,7 +20663,6 @@
                 <w:b/>
                 <w:sz w:val="19"/>
               </w:rPr>
-              <w:lastRenderedPageBreak/>
               <w:t>Main Success Flow</w:t>
             </w:r>
           </w:p>
@@ -20637,6 +20835,7 @@
           <w:lang w:val="en-DE"/>
         </w:rPr>
       </w:pPr>
+      <w:bookmarkStart w:id="8" w:name="_Hlk225608478"/>
       <w:r>
         <w:rPr>
           <w:lang w:val="en-DE"/>
@@ -20652,43 +20851,22 @@
           <w:lang w:val="en-DE"/>
         </w:rPr>
       </w:pPr>
+      <w:bookmarkStart w:id="9" w:name="_Hlk225608501"/>
+      <w:bookmarkEnd w:id="8"/>
       <w:r>
-        <w:t>UC-</w:t>
+        <w:rPr>
+          <w:lang w:val="en-DE"/>
+        </w:rPr>
+        <w:t>FR41 -</w:t>
+      </w:r>
+      <w:r>
+        <w:t xml:space="preserve"> </w:t>
       </w:r>
       <w:r>
         <w:rPr>
           <w:lang w:val="en-DE"/>
         </w:rPr>
-        <w:t>U</w:t>
-      </w:r>
-      <w:r>
-        <w:t>-</w:t>
-      </w:r>
-      <w:proofErr w:type="gramStart"/>
-      <w:r>
-        <w:t>0</w:t>
-      </w:r>
-      <w:r>
-        <w:rPr>
-          <w:lang w:val="en-DE"/>
-        </w:rPr>
-        <w:t>1</w:t>
-      </w:r>
-      <w:r>
-        <w:t xml:space="preserve">  </w:t>
-      </w:r>
-      <w:r>
-        <w:rPr>
-          <w:lang w:val="en-DE"/>
-        </w:rPr>
-        <w:t>Register</w:t>
-      </w:r>
-      <w:proofErr w:type="gramEnd"/>
-      <w:r>
-        <w:rPr>
-          <w:lang w:val="en-DE"/>
-        </w:rPr>
-        <w:t xml:space="preserve"> Account</w:t>
+        <w:t>Register Account</w:t>
       </w:r>
     </w:p>
     <w:tbl>
@@ -20718,6 +20896,7 @@
             </w:tcMar>
             <w:vAlign w:val="center"/>
           </w:tcPr>
+          <w:bookmarkEnd w:id="9"/>
           <w:p>
             <w:pPr>
               <w:spacing w:line="252" w:lineRule="auto"/>
@@ -20756,8 +20935,9 @@
                 <w:rFonts w:asciiTheme="majorHAnsi" w:hAnsiTheme="majorHAnsi" w:cstheme="majorHAnsi"/>
                 <w:sz w:val="19"/>
                 <w:szCs w:val="19"/>
-              </w:rPr>
-              <w:t>UC-</w:t>
+                <w:lang w:val="en-DE"/>
+              </w:rPr>
+              <w:t>FR41</w:t>
             </w:r>
             <w:r>
               <w:rPr>
@@ -20766,24 +20946,7 @@
                 <w:szCs w:val="19"/>
                 <w:lang w:val="en-DE"/>
               </w:rPr>
-              <w:t>U</w:t>
-            </w:r>
-            <w:r>
-              <w:rPr>
-                <w:rFonts w:asciiTheme="majorHAnsi" w:hAnsiTheme="majorHAnsi" w:cstheme="majorHAnsi"/>
-                <w:sz w:val="19"/>
-                <w:szCs w:val="19"/>
-              </w:rPr>
-              <w:t>-0</w:t>
-            </w:r>
-            <w:r>
-              <w:rPr>
-                <w:rFonts w:asciiTheme="majorHAnsi" w:hAnsiTheme="majorHAnsi" w:cstheme="majorHAnsi"/>
-                <w:sz w:val="19"/>
-                <w:szCs w:val="19"/>
-                <w:lang w:val="en-DE"/>
-              </w:rPr>
-              <w:t xml:space="preserve">1 </w:t>
+              <w:t xml:space="preserve"> </w:t>
             </w:r>
             <w:r>
               <w:rPr>
@@ -21323,21 +21486,36 @@
           <w:lang w:val="en-DE"/>
         </w:rPr>
       </w:pPr>
+    </w:p>
+    <w:p>
+      <w:pPr>
+        <w:pStyle w:val="Heading2"/>
+        <w:spacing w:before="80" w:after="60" w:line="264" w:lineRule="auto"/>
+        <w:rPr>
+          <w:lang w:val="en-DE"/>
+        </w:rPr>
+      </w:pPr>
+    </w:p>
+    <w:p>
+      <w:pPr>
+        <w:pStyle w:val="Heading2"/>
+        <w:spacing w:before="80" w:after="60" w:line="264" w:lineRule="auto"/>
+        <w:rPr>
+          <w:lang w:val="en-DE"/>
+        </w:rPr>
+      </w:pPr>
+      <w:bookmarkStart w:id="10" w:name="_Hlk225608555"/>
       <w:r>
-        <w:t>UC-</w:t>
+        <w:rPr>
+          <w:lang w:val="en-DE"/>
+        </w:rPr>
+        <w:t>FR</w:t>
       </w:r>
       <w:r>
         <w:rPr>
           <w:lang w:val="en-DE"/>
         </w:rPr>
-        <w:t>U</w:t>
-      </w:r>
-      <w:r>
-        <w:t>-</w:t>
-      </w:r>
-      <w:proofErr w:type="gramStart"/>
-      <w:r>
-        <w:t>0</w:t>
+        <w:t>4</w:t>
       </w:r>
       <w:r>
         <w:rPr>
@@ -21346,29 +21524,37 @@
         <w:t>2</w:t>
       </w:r>
       <w:r>
-        <w:t xml:space="preserve">  </w:t>
+        <w:t xml:space="preserve"> </w:t>
       </w:r>
       <w:r>
         <w:rPr>
           <w:lang w:val="en-DE"/>
         </w:rPr>
-        <w:t>User</w:t>
+        <w:t>-</w:t>
       </w:r>
-      <w:proofErr w:type="gramEnd"/>
+      <w:r>
+        <w:t xml:space="preserve"> </w:t>
+      </w:r>
+      <w:r>
+        <w:rPr>
+          <w:lang w:val="en-DE"/>
+        </w:rPr>
+        <w:t>User Log</w:t>
+      </w:r>
       <w:r>
         <w:rPr>
           <w:lang w:val="en-DE"/>
         </w:rPr>
         <w:t xml:space="preserve"> </w:t>
       </w:r>
-      <w:proofErr w:type="spellStart"/>
+      <w:bookmarkStart w:id="11" w:name="_GoBack"/>
+      <w:bookmarkEnd w:id="11"/>
       <w:r>
         <w:rPr>
           <w:lang w:val="en-DE"/>
         </w:rPr>
-        <w:t>LogIn</w:t>
+        <w:t>In</w:t>
       </w:r>
-      <w:proofErr w:type="spellEnd"/>
     </w:p>
     <w:tbl>
       <w:tblPr>
@@ -21397,6 +21583,7 @@
             </w:tcMar>
             <w:vAlign w:val="center"/>
           </w:tcPr>
+          <w:bookmarkEnd w:id="10"/>
           <w:p>
             <w:pPr>
               <w:spacing w:line="252" w:lineRule="auto"/>
@@ -21435,8 +21622,9 @@
                 <w:rFonts w:asciiTheme="majorHAnsi" w:hAnsiTheme="majorHAnsi" w:cstheme="majorHAnsi"/>
                 <w:sz w:val="19"/>
                 <w:szCs w:val="19"/>
-              </w:rPr>
-              <w:t>UC-</w:t>
+                <w:lang w:val="en-DE"/>
+              </w:rPr>
+              <w:t>FR4</w:t>
             </w:r>
             <w:r>
               <w:rPr>
@@ -21445,15 +21633,16 @@
                 <w:szCs w:val="19"/>
                 <w:lang w:val="en-DE"/>
               </w:rPr>
-              <w:t>U</w:t>
+              <w:t xml:space="preserve">2 </w:t>
             </w:r>
             <w:r>
               <w:rPr>
                 <w:rFonts w:asciiTheme="majorHAnsi" w:hAnsiTheme="majorHAnsi" w:cstheme="majorHAnsi"/>
                 <w:sz w:val="19"/>
                 <w:szCs w:val="19"/>
-              </w:rPr>
-              <w:t>-0</w:t>
+                <w:lang w:val="en-DE"/>
+              </w:rPr>
+              <w:sym w:font="Wingdings" w:char="F0E8"/>
             </w:r>
             <w:r>
               <w:rPr>
@@ -21462,7 +21651,7 @@
                 <w:szCs w:val="19"/>
                 <w:lang w:val="en-DE"/>
               </w:rPr>
-              <w:t xml:space="preserve">2 </w:t>
+              <w:t xml:space="preserve"> User Log</w:t>
             </w:r>
             <w:r>
               <w:rPr>
@@ -21471,7 +21660,7 @@
                 <w:szCs w:val="19"/>
                 <w:lang w:val="en-DE"/>
               </w:rPr>
-              <w:sym w:font="Wingdings" w:char="F0E8"/>
+              <w:t xml:space="preserve"> </w:t>
             </w:r>
             <w:r>
               <w:rPr>
@@ -21480,19 +21669,8 @@
                 <w:szCs w:val="19"/>
                 <w:lang w:val="en-DE"/>
               </w:rPr>
-              <w:t xml:space="preserve"> User </w:t>
-            </w:r>
-            <w:proofErr w:type="spellStart"/>
-            <w:r>
-              <w:rPr>
-                <w:rFonts w:asciiTheme="majorHAnsi" w:hAnsiTheme="majorHAnsi" w:cstheme="majorHAnsi"/>
-                <w:sz w:val="19"/>
-                <w:szCs w:val="19"/>
-                <w:lang w:val="en-DE"/>
-              </w:rPr>
-              <w:t>LogIn</w:t>
-            </w:r>
-            <w:proofErr w:type="spellEnd"/>
+              <w:t>In</w:t>
+            </w:r>
           </w:p>
         </w:tc>
       </w:tr>
@@ -21889,7 +22067,6 @@
                 <w:b/>
                 <w:sz w:val="19"/>
               </w:rPr>
-              <w:lastRenderedPageBreak/>
               <w:t>Alternative / Exception Flow</w:t>
             </w:r>
           </w:p>
@@ -22100,17 +22277,18 @@
           <w:u w:val="thick"/>
           <w:lang w:val="en-DE"/>
         </w:rPr>
+        <w:lastRenderedPageBreak/>
         <w:drawing>
-          <wp:anchor distT="0" distB="0" distL="114300" distR="114300" simplePos="0" relativeHeight="251658240" behindDoc="0" locked="0" layoutInCell="1" allowOverlap="1" wp14:anchorId="63C39AF8" wp14:editId="068A5DEA">
+          <wp:anchor distT="0" distB="0" distL="114300" distR="114300" simplePos="0" relativeHeight="251658240" behindDoc="0" locked="0" layoutInCell="1" allowOverlap="1" wp14:anchorId="63C39AF8" wp14:editId="3004195E">
             <wp:simplePos x="0" y="0"/>
             <wp:positionH relativeFrom="margin">
               <wp:posOffset>-621030</wp:posOffset>
             </wp:positionH>
             <wp:positionV relativeFrom="paragraph">
-              <wp:posOffset>310515</wp:posOffset>
+              <wp:posOffset>308610</wp:posOffset>
             </wp:positionV>
-            <wp:extent cx="7734300" cy="7248525"/>
-            <wp:effectExtent l="0" t="0" r="0" b="9525"/>
+            <wp:extent cx="7734300" cy="8382000"/>
+            <wp:effectExtent l="0" t="0" r="0" b="0"/>
             <wp:wrapTopAndBottom/>
             <wp:docPr id="1" name="Picture 1" descr="C:\Users\kevim\OneDrive\Pictures\Screenshots\Screenshot 2026-03-23 130349.png"/>
             <wp:cNvGraphicFramePr>
@@ -22141,7 +22319,7 @@
                   <pic:spPr bwMode="auto">
                     <a:xfrm>
                       <a:off x="0" y="0"/>
-                      <a:ext cx="7734300" cy="7248525"/>
+                      <a:ext cx="7734300" cy="8382000"/>
                     </a:xfrm>
                     <a:prstGeom prst="rect">
                       <a:avLst/>
@@ -22175,10 +22353,7 @@
         <w:t>Use Case Diagram</w:t>
       </w:r>
     </w:p>
-    <w:p>
-      <w:bookmarkStart w:id="0" w:name="_GoBack"/>
-      <w:bookmarkEnd w:id="0"/>
-    </w:p>
+    <w:p/>
     <w:sectPr>
       <w:footerReference w:type="default" r:id="rId9"/>
       <w:pgSz w:w="12240" w:h="15840"/>
@@ -34195,7 +34370,7 @@
 </file>
 
 <file path=customXml/itemProps1.xml><?xml version="1.0" encoding="utf-8"?>
-<ds:datastoreItem xmlns:ds="http://schemas.openxmlformats.org/officeDocument/2006/customXml" ds:itemID="{63D3ADCA-9562-4C02-9AB9-BD5E605CBAC3}">
+<ds:datastoreItem xmlns:ds="http://schemas.openxmlformats.org/officeDocument/2006/customXml" ds:itemID="{06C698A3-016B-48C7-943C-176EF4111685}">
   <ds:schemaRefs>
     <ds:schemaRef ds:uri="http://schemas.openxmlformats.org/officeDocument/2006/bibliography"/>
   </ds:schemaRefs>

</xml_diff>